<commit_message>
Fixed enemies, Tutorial 80% done
Fixed both Gwiber and K9's zone change code problem which was caused by missing variables and poor use of Brackets. I've finished the designs for the Tutorial and begun creating dialogue text for the characters planned for the narrative script of Critical failure
</commit_message>
<xml_diff>
--- a/Logs/Critical Failure Opening Narrative script.docx
+++ b/Logs/Critical Failure Opening Narrative script.docx
@@ -3,82 +3,196 @@
 <w:document xmlns:wpc="http://schemas.microsoft.com/office/word/2010/wordprocessingCanvas" xmlns:cx="http://schemas.microsoft.com/office/drawing/2014/chartex" xmlns:cx1="http://schemas.microsoft.com/office/drawing/2015/9/8/chartex" xmlns:cx2="http://schemas.microsoft.com/office/drawing/2015/10/21/chartex" xmlns:cx3="http://schemas.microsoft.com/office/drawing/2016/5/9/chartex" xmlns:cx4="http://schemas.microsoft.com/office/drawing/2016/5/10/chartex" xmlns:cx5="http://schemas.microsoft.com/office/drawing/2016/5/11/chartex" xmlns:cx6="http://schemas.microsoft.com/office/drawing/2016/5/12/chartex" xmlns:cx7="http://schemas.microsoft.com/office/drawing/2016/5/13/chartex" xmlns:cx8="http://schemas.microsoft.com/office/drawing/2016/5/14/chartex" xmlns:mc="http://schemas.openxmlformats.org/markup-compatibility/2006" xmlns:aink="http://schemas.microsoft.com/office/drawing/2016/ink" xmlns:am3d="http://schemas.microsoft.com/office/drawing/2017/model3d" xmlns:o="urn:schemas-microsoft-com:office:office" xmlns:oel="http://schemas.microsoft.com/office/2019/extlst" xmlns:r="http://schemas.openxmlformats.org/officeDocument/2006/relationships" xmlns:m="http://schemas.openxmlformats.org/officeDocument/2006/math" xmlns:v="urn:schemas-microsoft-com:vml" xmlns:wp14="http://schemas.microsoft.com/office/word/2010/wordprocessingDrawing" xmlns:wp="http://schemas.openxmlformats.org/drawingml/2006/wordprocessingDrawing" xmlns:w10="urn:schemas-microsoft-com:office:word" xmlns:w="http://schemas.openxmlformats.org/wordprocessingml/2006/main" xmlns:w14="http://schemas.microsoft.com/office/word/2010/wordml" xmlns:w15="http://schemas.microsoft.com/office/word/2012/wordml" xmlns:w16cex="http://schemas.microsoft.com/office/word/2018/wordml/cex" xmlns:w16cid="http://schemas.microsoft.com/office/word/2016/wordml/cid" xmlns:w16="http://schemas.microsoft.com/office/word/2018/wordml" xmlns:w16du="http://schemas.microsoft.com/office/word/2023/wordml/word16du" xmlns:w16sdtdh="http://schemas.microsoft.com/office/word/2020/wordml/sdtdatahash" xmlns:w16sdtfl="http://schemas.microsoft.com/office/word/2024/wordml/sdtformatlock" xmlns:w16se="http://schemas.microsoft.com/office/word/2015/wordml/symex" xmlns:wpg="http://schemas.microsoft.com/office/word/2010/wordprocessingGroup" xmlns:wpi="http://schemas.microsoft.com/office/word/2010/wordprocessingInk" xmlns:wne="http://schemas.microsoft.com/office/word/2006/wordml" xmlns:wps="http://schemas.microsoft.com/office/word/2010/wordprocessingShape" mc:Ignorable="w14 w15 w16se w16cid w16 w16cex w16sdtdh w16sdtfl w16du wp14">
   <w:body>
     <w:p>
-      <w:r>
+      <w:pPr>
+        <w:rPr>
+          <w:highlight w:val="yellow"/>
+        </w:rPr>
+      </w:pPr>
+      <w:r>
+        <w:rPr>
+          <w:highlight w:val="yellow"/>
+        </w:rPr>
         <w:t>(Player is inside an elevator going down)</w:t>
       </w:r>
     </w:p>
     <w:p>
-      <w:r>
+      <w:pPr>
+        <w:rPr>
+          <w:highlight w:val="yellow"/>
+        </w:rPr>
+      </w:pPr>
+      <w:r>
+        <w:rPr>
+          <w:highlight w:val="yellow"/>
+        </w:rPr>
         <w:t xml:space="preserve"> (elevator doors open) </w:t>
       </w:r>
     </w:p>
     <w:p>
-      <w:r>
+      <w:pPr>
+        <w:rPr>
+          <w:highlight w:val="yellow"/>
+        </w:rPr>
+      </w:pPr>
+      <w:r>
+        <w:rPr>
+          <w:highlight w:val="yellow"/>
+        </w:rPr>
         <w:t xml:space="preserve">(Player walks out towards the office) </w:t>
       </w:r>
     </w:p>
     <w:p>
-      <w:r>
+      <w:pPr>
+        <w:rPr>
+          <w:highlight w:val="yellow"/>
+        </w:rPr>
+      </w:pPr>
+      <w:r>
+        <w:rPr>
+          <w:highlight w:val="yellow"/>
+        </w:rPr>
         <w:t>(crowd noise)</w:t>
       </w:r>
     </w:p>
     <w:p>
-      <w:r>
+      <w:pPr>
+        <w:rPr>
+          <w:highlight w:val="yellow"/>
+        </w:rPr>
+      </w:pPr>
+      <w:r>
+        <w:rPr>
+          <w:highlight w:val="yellow"/>
+        </w:rPr>
         <w:t xml:space="preserve"> (Player approaches the office and sees a man)</w:t>
       </w:r>
     </w:p>
     <w:p>
-      <w:r>
+      <w:pPr>
+        <w:rPr>
+          <w:highlight w:val="yellow"/>
+        </w:rPr>
+      </w:pPr>
+      <w:r>
+        <w:rPr>
+          <w:highlight w:val="yellow"/>
+        </w:rPr>
         <w:t xml:space="preserve"> Rob: Hey, you the new security guard? </w:t>
       </w:r>
     </w:p>
     <w:p>
-      <w:r>
+      <w:pPr>
+        <w:rPr>
+          <w:highlight w:val="yellow"/>
+        </w:rPr>
+      </w:pPr>
+      <w:r>
+        <w:rPr>
+          <w:highlight w:val="yellow"/>
+        </w:rPr>
         <w:t xml:space="preserve">Player: Yes, I am and who are you? </w:t>
       </w:r>
     </w:p>
     <w:p>
       <w:r>
+        <w:rPr>
+          <w:highlight w:val="yellow"/>
+        </w:rPr>
         <w:t xml:space="preserve">Rob: I’m the guy your helping </w:t>
       </w:r>
       <w:proofErr w:type="gramStart"/>
       <w:r>
+        <w:rPr>
+          <w:highlight w:val="yellow"/>
+        </w:rPr>
         <w:t>get</w:t>
       </w:r>
       <w:proofErr w:type="gramEnd"/>
       <w:r>
-        <w:t xml:space="preserve"> into retirement, names Rob </w:t>
-      </w:r>
-    </w:p>
-    <w:p>
-      <w:r>
-        <w:t xml:space="preserve">Player: Nice to meet you Rob, can I ask about why you retiring? </w:t>
-      </w:r>
-    </w:p>
-    <w:p>
-      <w:r>
+        <w:rPr>
+          <w:highlight w:val="yellow"/>
+        </w:rPr>
+        <w:t xml:space="preserve"> into retirement, names Rob</w:t>
+      </w:r>
+      <w:r>
+        <w:t xml:space="preserve"> </w:t>
+      </w:r>
+    </w:p>
+    <w:p>
+      <w:r>
+        <w:rPr>
+          <w:highlight w:val="yellow"/>
+        </w:rPr>
+        <w:t>Player: Nice to meet you Rob, can I ask about why you retiring?</w:t>
+      </w:r>
+      <w:r>
+        <w:t xml:space="preserve"> </w:t>
+      </w:r>
+    </w:p>
+    <w:p>
+      <w:pPr>
+        <w:rPr>
+          <w:highlight w:val="yellow"/>
+        </w:rPr>
+      </w:pPr>
+      <w:r>
+        <w:rPr>
+          <w:highlight w:val="yellow"/>
+        </w:rPr>
         <w:t xml:space="preserve">Rob: </w:t>
       </w:r>
       <w:r>
+        <w:rPr>
+          <w:highlight w:val="yellow"/>
+        </w:rPr>
         <w:t>O</w:t>
       </w:r>
       <w:r>
+        <w:rPr>
+          <w:highlight w:val="yellow"/>
+        </w:rPr>
         <w:t>h, well that’s easy, I’m too old to be doing this job thousands of feet underground away from my family, so while I’m still able to walk, I want to spend the rest of my life with those I love.</w:t>
       </w:r>
     </w:p>
     <w:p>
-      <w:r>
+      <w:pPr>
+        <w:rPr>
+          <w:highlight w:val="yellow"/>
+        </w:rPr>
+      </w:pPr>
+      <w:r>
+        <w:rPr>
+          <w:highlight w:val="yellow"/>
+        </w:rPr>
         <w:t xml:space="preserve"> Player: That’s great congrats.</w:t>
       </w:r>
     </w:p>
     <w:p>
       <w:r>
-        <w:t xml:space="preserve"> Rob: Yeah, but enough about me, the higher ups wanted me to give you a rundown of what you’ll do and what you'll be required to complete during the nights. </w:t>
-      </w:r>
-    </w:p>
-    <w:p>
-      <w:r>
-        <w:t xml:space="preserve">Rob: First things first, have you agreed to the terms and conditions stating that the company holds no responsibility to any injuries you may have while working here? </w:t>
+        <w:rPr>
+          <w:highlight w:val="yellow"/>
+        </w:rPr>
+        <w:t xml:space="preserve"> Rob: Yeah, but enough about me</w:t>
+      </w:r>
+      <w:r>
+        <w:rPr>
+          <w:highlight w:val="yellow"/>
+        </w:rPr>
+        <w:t>, the higher ups wanted me to give you a rundown of what you’ll do and what you'll be required to complete during the nights.</w:t>
+      </w:r>
+      <w:r>
+        <w:t xml:space="preserve"> </w:t>
+      </w:r>
+    </w:p>
+    <w:p>
+      <w:r>
+        <w:rPr>
+          <w:highlight w:val="yellow"/>
+        </w:rPr>
+        <w:t>Rob: First things first, have you agreed to the terms and conditions stating that the company holds no responsibility to any injuries you may have while working here?</w:t>
+      </w:r>
+      <w:r>
+        <w:t xml:space="preserve"> </w:t>
       </w:r>
     </w:p>
     <w:p>
@@ -205,16 +319,9 @@
       <w:r>
         <w:t xml:space="preserve">Player: Are they </w:t>
       </w:r>
-      <w:proofErr w:type="spellStart"/>
-      <w:proofErr w:type="gramStart"/>
-      <w:r>
-        <w:t>suppose</w:t>
-      </w:r>
-      <w:proofErr w:type="gramEnd"/>
-      <w:r>
-        <w:t xml:space="preserve"> to</w:t>
-      </w:r>
-      <w:proofErr w:type="spellEnd"/>
+      <w:r>
+        <w:t>supposed to</w:t>
+      </w:r>
       <w:r>
         <w:t xml:space="preserve"> do that?</w:t>
       </w:r>
@@ -592,11 +699,14 @@
       </w:r>
       <w:proofErr w:type="gramStart"/>
       <w:r>
-        <w:t>…..</w:t>
+        <w:t>….</w:t>
+      </w:r>
+      <w:r>
+        <w:t>Yes</w:t>
       </w:r>
       <w:proofErr w:type="gramEnd"/>
       <w:r>
-        <w:t xml:space="preserve">Yes </w:t>
+        <w:t xml:space="preserve"> </w:t>
       </w:r>
     </w:p>
     <w:p>

</xml_diff>